<commit_message>
Rename trainee in Scenario 6 to Hitler
</commit_message>
<xml_diff>
--- a/Scenario_6_Promotion_Dangle.docx
+++ b/Scenario_6_Promotion_Dangle.docx
@@ -157,7 +157,7 @@
         <w:spacing w:after="120" w:before="0"/>
       </w:pPr>
       <w:r>
-        <w:t xml:space="preserve">Acme Lock &amp; Security Systems is a mid-size private manufacturer of correctional and prison-grade locking systems. Engineering department of about thirty. The student is one of four design engineers reporting to the engineering manager. All four engineers (the student, Kankles, Hitch, Jerome) are PEERS — no internal hierarchy among them. They all report to Goliath. The new manager, Goliath, took the role six months ago after a stint in consumer-goods packaging. He is smart and decent but does not yet fully understand how engineering work flows. The student is functionally already running the team’s day-to-day workflow without title or pay to match. The Engineering Lead role Goliath has been hinting at would create a NEW position above the four-engineer peer group; it is not a backfill of any existing slot.</w:t>
+        <w:t xml:space="preserve">Acme Lock &amp; Security Systems is a mid-size private manufacturer of correctional and prison-grade locking systems. Engineering department of about thirty. The student is one of four design engineers reporting to the engineering manager. All four engineers (the student, Kankles, Hitler, Jerome) are PEERS — no internal hierarchy among them. They all report to Goliath. The new manager, Goliath, took the role six months ago after a stint in consumer-goods packaging. He is smart and decent but does not yet fully understand how engineering work flows. The student is functionally already running the team’s day-to-day workflow without title or pay to match. The Engineering Lead role Goliath has been hinting at would create a NEW position above the four-engineer peer group; it is not a backfill of any existing slot.</w:t>
       </w:r>
     </w:p>
     <w:p>
@@ -357,7 +357,7 @@
         <w:t xml:space="preserve">Operational and structural context: </w:t>
       </w:r>
       <w:r>
-        <w:t xml:space="preserve">The student has been informally enforcing schedules, mentoring Hitch on CAD, absorbing Kankles’ errors, and chasing peers for Wednesday estimates. Mondays: assignments go out on Smartsheet with two days for peers to review and respond with completion estimates. Wednesdays: team meeting where peers should arrive with estimates ready. In practice nobody reviews. They guess on the spot. Estimates are wildly optimistic. Then they miss the dates. The student gets blamed for slipping schedules even though the student did not produce the estimates. Goliath has hinted at the promotion four times in six months but has never put it in writing or named a date.</w:t>
+        <w:t xml:space="preserve">The student has been informally enforcing schedules, mentoring Hitler on CAD, absorbing Kankles’ errors, and chasing peers for Wednesday estimates. Mondays: assignments go out on Smartsheet with two days for peers to review and respond with completion estimates. Wednesdays: team meeting where peers should arrive with estimates ready. In practice nobody reviews. They guess on the spot. Estimates are wildly optimistic. Then they miss the dates. The student gets blamed for slipping schedules even though the student did not produce the estimates. Goliath has hinted at the promotion four times in six months but has never put it in writing or named a date.</w:t>
       </w:r>
     </w:p>
     <w:p>
@@ -453,7 +453,7 @@
           <w:bCs/>
           <w:color w:val="B85042"/>
         </w:rPr>
-        <w:t xml:space="preserve">Hitch — Junior Design Engineer (three months in)</w:t>
+        <w:t xml:space="preserve">Hitler — Junior Design Engineer (three months in)</w:t>
       </w:r>
     </w:p>
     <w:p>
@@ -499,7 +499,7 @@
         <w:t xml:space="preserve">How he behaves with the student: </w:t>
       </w:r>
       <w:r>
-        <w:t xml:space="preserve">Enthusiastic, asks lots of questions. “Totally,” “for sure,” “yeah I noticed that too.” If the student asks for objective data on team workflow he provides it because he tracks everything. Does NOT want to be the new guy who got the old guy fired — push back if the student tries to use him as a hatchet. But if the student frames it as “help me document the structural pattern for Goliath,” Hitch is in.</w:t>
+        <w:t xml:space="preserve">Enthusiastic, asks lots of questions. “Totally,” “for sure,” “yeah I noticed that too.” If the student asks for objective data on team workflow he provides it because he tracks everything. Does NOT want to be the new guy who got the old guy fired — push back if the student tries to use him as a hatchet. But if the student frames it as “help me document the structural pattern for Goliath,” Hitler is in.</w:t>
       </w:r>
     </w:p>
     <w:p>
@@ -1322,7 +1322,7 @@
                 <w:bCs w:val="false"/>
                 <w:color w:val="000000"/>
               </w:rPr>
-              <w:t xml:space="preserve">Document pattern data over 60-90 days. Cultivate Hitch as documentation ally. Use Jerome as candid peer to validate. Bring Goliath TWO independent structural cases: (1) Kankles’ documented underperformance — here is what HR needs to act; (2) the Engineering Lead role — here is the team-productivity case for funding it. Ask for authority on the role, not a raise.</w:t>
+              <w:t xml:space="preserve">Document pattern data over 60-90 days. Cultivate Hitler as documentation ally. Use Jerome as candid peer to validate. Bring Goliath TWO independent structural cases: (1) Kankles’ documented underperformance — here is what HR needs to act; (2) the Engineering Lead role — here is the team-productivity case for funding it. Ask for authority on the role, not a raise.</w:t>
             </w:r>
           </w:p>
         </w:tc>
@@ -1474,7 +1474,7 @@
               <w:t xml:space="preserve">Optimal Outcome: </w:t>
             </w:r>
             <w:r>
-              <w:t xml:space="preserve">Path D. The student’s strongest move is to engineer the situation so Goliath makes two SEPARATE good decisions, not to do either of them yourself. Three concrete moves carry the path. First, document for sixty to ninety days: every Wednesday meeting (who showed up with estimates, who guessed), every project (estimated date vs actual, by engineer), and Kankles’ rework rate and customer impact. Two months of data is enough to make the Kankles pattern undeniable. Second, engage Hitch as documentation ally (he already keeps meticulous notes — ask him to share them) and Jerome as candid peer (ask his honest read as a peer, not a manager; he will give it). Do NOT engage Kankles in confrontation — you are peers, you have no authority over him. Just document. Third, ask Goliath for a one-on-one. Bring TWO separate cases. On Kankles: “Here is the documentation. A 30-day CAD-competency PIP gives HR what they need; Kankles will not pass it. Once he’s out, the slot gets backfilled through normal hiring.” On the promotion: “Separately — here’s the case for the Engineering Lead role. Here’s the work I’m already doing, the accountability gap on the team, the productivity case for funding the role. I need a title, the authority to assign and accept work, and a date inside 90 days. The pay can follow once the role is formalized.” Two independent structural arguments, two independent commitments. That’s the win.</w:t>
+              <w:t xml:space="preserve">Path D. The student’s strongest move is to engineer the situation so Goliath makes two SEPARATE good decisions, not to do either of them yourself. Three concrete moves carry the path. First, document for sixty to ninety days: every Wednesday meeting (who showed up with estimates, who guessed), every project (estimated date vs actual, by engineer), and Kankles’ rework rate and customer impact. Two months of data is enough to make the Kankles pattern undeniable. Second, engage Hitler as documentation ally (he already keeps meticulous notes — ask him to share them) and Jerome as candid peer (ask his honest read as a peer, not a manager; he will give it). Do NOT engage Kankles in confrontation — you are peers, you have no authority over him. Just document. Third, ask Goliath for a one-on-one. Bring TWO separate cases. On Kankles: “Here is the documentation. A 30-day CAD-competency PIP gives HR what they need; Kankles will not pass it. Once he’s out, the slot gets backfilled through normal hiring.” On the promotion: “Separately — here’s the case for the Engineering Lead role. Here’s the work I’m already doing, the accountability gap on the team, the productivity case for funding the role. I need a title, the authority to assign and accept work, and a date inside 90 days. The pay can follow once the role is formalized.” Two independent structural arguments, two independent commitments. That’s the win.</w:t>
             </w:r>
           </w:p>
         </w:tc>

</xml_diff>